<commit_message>
Make parse-check text patterns linear and cap DOCX fields
Replace the email, phone, quantification, and link patterns with bounded,
lookbehind-anchored forms so 200k characters of hostile text are checked
in linear time, and cap header/footer and text-box text like body text.
Phone detection now requires 10-15 digits and rejects year ranges, which
previously passed contact_phone and hid header-only phones. Text boxes
stored as both DrawingML and VML fallback are counted once.

Co-Authored-By: Claude Opus 5.5 (1M context) <noreply@anthropic.com>
</commit_message>
<xml_diff>
--- a/apps/backend/tests/fixtures/ats_parse/contact_in_header.docx
+++ b/apps/backend/tests/fixtures/ats_parse/contact_in_header.docx
@@ -158,6 +158,19 @@
     <w:p>
       <w:r>
         <w:t>Python, Go, PostgreSQL, Kafka, Kubernetes, Terraform, FastAPI, React</w:t>
+      </w:r>
+    </w:p>
+    <w:p>
+      <w:pPr>
+        <w:pStyle w:val="Heading2"/>
+      </w:pPr>
+      <w:r>
+        <w:t>Volunteering</w:t>
+      </w:r>
+    </w:p>
+    <w:p>
+      <w:r>
+        <w:t>Mentor, Harbor Code Club 2015 - 2019 2019 - 2021</w:t>
       </w:r>
     </w:p>
     <w:sectPr>

</xml_diff>